<commit_message>
corresponding readme + report updates for recovered math500 ablated runs
</commit_message>
<xml_diff>
--- a/report.docx
+++ b/report.docx
@@ -710,7 +710,7 @@
           <w:sz w:val="21"/>
           <w:szCs w:val="21"/>
         </w:rPr>
-        <w:t xml:space="preserve">Runs were generated on rented CUDA pods, never mixing backends within a comparison. The AIME cot_ablated cell holds 20 of 30 problems by protocol, not by budget: too many ablated generations ran to the 32,768-token cap, and the pre-registered degeneration gate fired and stopped the cell after its 20-problem window (§4). The MATH-500 cot_ablated records were accidentally lost before merging; the cell is being regenerated and will be added by noon on 8/6 — MATH-500 is analyzed below without it.</w:t>
+        <w:t xml:space="preserve">Runs were generated on rented CUDA pods, never mixing backends within a comparison. The AIME cot_ablated cell holds 20 of 30 problems by protocol, not by budget: too many ablated generations ran to the 32,768-token cap, and the pre-registered degeneration gate fired and stopped the cell after its 20-problem window (§4). The MATH-500 cot_ablated cell ran to completion once, its records were accidentally lost before merging, and the cell was regenerated on 8/6 under the same pre-registered condition and cap. The regeneration necessarily happened after the other five cells' results were known; nothing about the condition is chosen at run time, but the ordering is disclosed.</w:t>
       </w:r>
     </w:p>
     <w:p>
@@ -2814,7 +2814,7 @@
           <w:sz w:val="22"/>
           <w:szCs w:val="22"/>
         </w:rPr>
-        <w:t xml:space="preserve">MATH-500 (n = 150, stratified 30/level; cot_ablated pending)</w:t>
+        <w:t xml:space="preserve">MATH-500 (n = 150, stratified 30/level)</w:t>
       </w:r>
     </w:p>
     <w:tbl>
@@ -3197,7 +3197,7 @@
                 <w:sz w:val="19"/>
                 <w:szCs w:val="19"/>
               </w:rPr>
-              <w:t xml:space="preserve">—</w:t>
+              <w:t xml:space="preserve">150</w:t>
             </w:r>
           </w:p>
         </w:tc>
@@ -3222,7 +3222,7 @@
                 <w:sz w:val="19"/>
                 <w:szCs w:val="19"/>
               </w:rPr>
-              <w:t xml:space="preserve">pending†</w:t>
+              <w:t xml:space="preserve">88.0%</w:t>
             </w:r>
           </w:p>
         </w:tc>
@@ -3247,7 +3247,7 @@
                 <w:sz w:val="19"/>
                 <w:szCs w:val="19"/>
               </w:rPr>
-              <w:t xml:space="preserve">—</w:t>
+              <w:t xml:space="preserve">132</w:t>
             </w:r>
           </w:p>
         </w:tc>
@@ -3272,7 +3272,7 @@
                 <w:sz w:val="19"/>
                 <w:szCs w:val="19"/>
               </w:rPr>
-              <w:t xml:space="preserve">—</w:t>
+              <w:t xml:space="preserve">1</w:t>
             </w:r>
           </w:p>
         </w:tc>
@@ -3297,7 +3297,7 @@
                 <w:sz w:val="19"/>
                 <w:szCs w:val="19"/>
               </w:rPr>
-              <w:t xml:space="preserve">—</w:t>
+              <w:t xml:space="preserve">17</w:t>
             </w:r>
           </w:p>
         </w:tc>
@@ -3924,7 +3924,7 @@
           <w:sz w:val="18"/>
           <w:szCs w:val="18"/>
         </w:rPr>
-        <w:t xml:space="preserve">Table 3. MATH-500 cell accuracies (level-balanced averages, not comparable to split-weighted published numbers). †The cot_ablated records were accidentally lost before merging; the regenerated cell will be added by noon 8/6.</w:t>
+        <w:t xml:space="preserve">Table 3. MATH-500 cell accuracies (level-balanced averages, not comparable to split-weighted published numbers). The cot_ablated records were accidentally lost after a completed run and the cell was regenerated on 8/6 — after the other five cells' results were known; the condition and cap are pre-registered and identical.</w:t>
       </w:r>
     </w:p>
     <w:tbl>
@@ -4103,7 +4103,7 @@
                 <w:sz w:val="19"/>
                 <w:szCs w:val="19"/>
               </w:rPr>
-              <w:t xml:space="preserve">CoT: random vs intact (McNemar)</w:t>
+              <w:t xml:space="preserve">CoT: ablated vs intact (McNemar)</w:t>
             </w:r>
           </w:p>
         </w:tc>
@@ -4128,7 +4128,7 @@
                 <w:sz w:val="19"/>
                 <w:szCs w:val="19"/>
               </w:rPr>
-              <w:t xml:space="preserve">+2.0</w:t>
+              <w:t xml:space="preserve">−6.0</w:t>
             </w:r>
           </w:p>
         </w:tc>
@@ -4178,7 +4178,7 @@
                 <w:sz w:val="19"/>
                 <w:szCs w:val="19"/>
               </w:rPr>
-              <w:t xml:space="preserve">0.453</w:t>
+              <w:t xml:space="preserve">0.078</w:t>
             </w:r>
           </w:p>
         </w:tc>
@@ -4230,7 +4230,7 @@
                 <w:sz w:val="19"/>
                 <w:szCs w:val="19"/>
               </w:rPr>
-              <w:t xml:space="preserve">Direct: ablated vs intact (McNemar)</w:t>
+              <w:t xml:space="preserve">CoT: random vs intact (McNemar)</w:t>
             </w:r>
           </w:p>
         </w:tc>
@@ -4255,7 +4255,7 @@
                 <w:sz w:val="19"/>
                 <w:szCs w:val="19"/>
               </w:rPr>
-              <w:t xml:space="preserve">−3.3</w:t>
+              <w:t xml:space="preserve">+2.0</w:t>
             </w:r>
           </w:p>
         </w:tc>
@@ -4305,7 +4305,7 @@
                 <w:sz w:val="19"/>
                 <w:szCs w:val="19"/>
               </w:rPr>
-              <w:t xml:space="preserve">0.227</w:t>
+              <w:t xml:space="preserve">0.453</w:t>
             </w:r>
           </w:p>
         </w:tc>
@@ -4357,7 +4357,7 @@
                 <w:sz w:val="19"/>
                 <w:szCs w:val="19"/>
               </w:rPr>
-              <w:t xml:space="preserve">Direct: random vs intact (McNemar)</w:t>
+              <w:t xml:space="preserve">Direct: ablated vs intact (McNemar)</w:t>
             </w:r>
           </w:p>
         </w:tc>
@@ -4382,7 +4382,7 @@
                 <w:sz w:val="19"/>
                 <w:szCs w:val="19"/>
               </w:rPr>
-              <w:t xml:space="preserve">−5.3</w:t>
+              <w:t xml:space="preserve">−3.3</w:t>
             </w:r>
           </w:p>
         </w:tc>
@@ -4432,7 +4432,7 @@
                 <w:sz w:val="19"/>
                 <w:szCs w:val="19"/>
               </w:rPr>
-              <w:t xml:space="preserve">0.008</w:t>
+              <w:t xml:space="preserve">0.227</w:t>
             </w:r>
           </w:p>
         </w:tc>
@@ -4484,6 +4484,260 @@
                 <w:sz w:val="19"/>
                 <w:szCs w:val="19"/>
               </w:rPr>
+              <w:t xml:space="preserve">Direct: random vs intact (McNemar)</w:t>
+            </w:r>
+          </w:p>
+        </w:tc>
+        <w:tc>
+          <w:tcPr>
+            <w:tcW w:type="dxa" w:w="1450"/>
+            <w:tcMar>
+              <w:top w:type="dxa" w:w="40"/>
+              <w:left w:type="dxa" w:w="80"/>
+              <w:bottom w:type="dxa" w:w="40"/>
+              <w:right w:type="dxa" w:w="80"/>
+            </w:tcMar>
+          </w:tcPr>
+          <w:p>
+            <w:pPr>
+              <w:jc w:val="center"/>
+            </w:pPr>
+            <w:r>
+              <w:rPr>
+                <w:b w:val="false"/>
+                <w:bCs w:val="false"/>
+                <w:sz w:val="19"/>
+                <w:szCs w:val="19"/>
+              </w:rPr>
+              <w:t xml:space="preserve">−5.3</w:t>
+            </w:r>
+          </w:p>
+        </w:tc>
+        <w:tc>
+          <w:tcPr>
+            <w:tcW w:type="dxa" w:w="1900"/>
+            <w:tcMar>
+              <w:top w:type="dxa" w:w="40"/>
+              <w:left w:type="dxa" w:w="80"/>
+              <w:bottom w:type="dxa" w:w="40"/>
+              <w:right w:type="dxa" w:w="80"/>
+            </w:tcMar>
+          </w:tcPr>
+          <w:p>
+            <w:pPr>
+              <w:jc w:val="center"/>
+            </w:pPr>
+            <w:r>
+              <w:rPr>
+                <w:b w:val="false"/>
+                <w:bCs w:val="false"/>
+                <w:sz w:val="19"/>
+                <w:szCs w:val="19"/>
+              </w:rPr>
+              <w:t xml:space="preserve">—</w:t>
+            </w:r>
+          </w:p>
+        </w:tc>
+        <w:tc>
+          <w:tcPr>
+            <w:tcW w:type="dxa" w:w="1350"/>
+            <w:tcMar>
+              <w:top w:type="dxa" w:w="40"/>
+              <w:left w:type="dxa" w:w="80"/>
+              <w:bottom w:type="dxa" w:w="40"/>
+              <w:right w:type="dxa" w:w="80"/>
+            </w:tcMar>
+          </w:tcPr>
+          <w:p>
+            <w:pPr>
+              <w:jc w:val="center"/>
+            </w:pPr>
+            <w:r>
+              <w:rPr>
+                <w:b w:val="false"/>
+                <w:bCs w:val="false"/>
+                <w:sz w:val="19"/>
+                <w:szCs w:val="19"/>
+              </w:rPr>
+              <w:t xml:space="preserve">0.008</w:t>
+            </w:r>
+          </w:p>
+        </w:tc>
+        <w:tc>
+          <w:tcPr>
+            <w:tcW w:type="dxa" w:w="1000"/>
+            <w:tcMar>
+              <w:top w:type="dxa" w:w="40"/>
+              <w:left w:type="dxa" w:w="80"/>
+              <w:bottom w:type="dxa" w:w="40"/>
+              <w:right w:type="dxa" w:w="80"/>
+            </w:tcMar>
+          </w:tcPr>
+          <w:p>
+            <w:pPr>
+              <w:jc w:val="center"/>
+            </w:pPr>
+            <w:r>
+              <w:rPr>
+                <w:b w:val="false"/>
+                <w:bCs w:val="false"/>
+                <w:sz w:val="19"/>
+                <w:szCs w:val="19"/>
+              </w:rPr>
+              <w:t xml:space="preserve">150</w:t>
+            </w:r>
+          </w:p>
+        </w:tc>
+      </w:tr>
+      <w:tr>
+        <w:tc>
+          <w:tcPr>
+            <w:tcW w:type="dxa" w:w="2400"/>
+            <w:tcMar>
+              <w:top w:type="dxa" w:w="40"/>
+              <w:left w:type="dxa" w:w="80"/>
+              <w:bottom w:type="dxa" w:w="40"/>
+              <w:right w:type="dxa" w:w="80"/>
+            </w:tcMar>
+          </w:tcPr>
+          <w:p>
+            <w:pPr>
+              <w:jc w:val="left"/>
+            </w:pPr>
+            <w:r>
+              <w:rPr>
+                <w:b w:val="false"/>
+                <w:bCs w:val="false"/>
+                <w:sz w:val="19"/>
+                <w:szCs w:val="19"/>
+              </w:rPr>
+              <w:t xml:space="preserve">Selectivity, CoT arm</w:t>
+            </w:r>
+          </w:p>
+        </w:tc>
+        <w:tc>
+          <w:tcPr>
+            <w:tcW w:type="dxa" w:w="1450"/>
+            <w:tcMar>
+              <w:top w:type="dxa" w:w="40"/>
+              <w:left w:type="dxa" w:w="80"/>
+              <w:bottom w:type="dxa" w:w="40"/>
+              <w:right w:type="dxa" w:w="80"/>
+            </w:tcMar>
+          </w:tcPr>
+          <w:p>
+            <w:pPr>
+              <w:jc w:val="center"/>
+            </w:pPr>
+            <w:r>
+              <w:rPr>
+                <w:b w:val="false"/>
+                <w:bCs w:val="false"/>
+                <w:sz w:val="19"/>
+                <w:szCs w:val="19"/>
+              </w:rPr>
+              <w:t xml:space="preserve">+8.0</w:t>
+            </w:r>
+          </w:p>
+        </w:tc>
+        <w:tc>
+          <w:tcPr>
+            <w:tcW w:type="dxa" w:w="1900"/>
+            <w:tcMar>
+              <w:top w:type="dxa" w:w="40"/>
+              <w:left w:type="dxa" w:w="80"/>
+              <w:bottom w:type="dxa" w:w="40"/>
+              <w:right w:type="dxa" w:w="80"/>
+            </w:tcMar>
+          </w:tcPr>
+          <w:p>
+            <w:pPr>
+              <w:jc w:val="center"/>
+            </w:pPr>
+            <w:r>
+              <w:rPr>
+                <w:b w:val="false"/>
+                <w:bCs w:val="false"/>
+                <w:sz w:val="19"/>
+                <w:szCs w:val="19"/>
+              </w:rPr>
+              <w:t xml:space="preserve">[+3.3, +13.3]</w:t>
+            </w:r>
+          </w:p>
+        </w:tc>
+        <w:tc>
+          <w:tcPr>
+            <w:tcW w:type="dxa" w:w="1350"/>
+            <w:tcMar>
+              <w:top w:type="dxa" w:w="40"/>
+              <w:left w:type="dxa" w:w="80"/>
+              <w:bottom w:type="dxa" w:w="40"/>
+              <w:right w:type="dxa" w:w="80"/>
+            </w:tcMar>
+          </w:tcPr>
+          <w:p>
+            <w:pPr>
+              <w:jc w:val="center"/>
+            </w:pPr>
+            <w:r>
+              <w:rPr>
+                <w:b w:val="false"/>
+                <w:bCs w:val="false"/>
+                <w:sz w:val="19"/>
+                <w:szCs w:val="19"/>
+              </w:rPr>
+              <w:t xml:space="preserve">0.001</w:t>
+            </w:r>
+          </w:p>
+        </w:tc>
+        <w:tc>
+          <w:tcPr>
+            <w:tcW w:type="dxa" w:w="1000"/>
+            <w:tcMar>
+              <w:top w:type="dxa" w:w="40"/>
+              <w:left w:type="dxa" w:w="80"/>
+              <w:bottom w:type="dxa" w:w="40"/>
+              <w:right w:type="dxa" w:w="80"/>
+            </w:tcMar>
+          </w:tcPr>
+          <w:p>
+            <w:pPr>
+              <w:jc w:val="center"/>
+            </w:pPr>
+            <w:r>
+              <w:rPr>
+                <w:b w:val="false"/>
+                <w:bCs w:val="false"/>
+                <w:sz w:val="19"/>
+                <w:szCs w:val="19"/>
+              </w:rPr>
+              <w:t xml:space="preserve">150</w:t>
+            </w:r>
+          </w:p>
+        </w:tc>
+      </w:tr>
+      <w:tr>
+        <w:tc>
+          <w:tcPr>
+            <w:tcW w:type="dxa" w:w="2400"/>
+            <w:tcMar>
+              <w:top w:type="dxa" w:w="40"/>
+              <w:left w:type="dxa" w:w="80"/>
+              <w:bottom w:type="dxa" w:w="40"/>
+              <w:right w:type="dxa" w:w="80"/>
+            </w:tcMar>
+          </w:tcPr>
+          <w:p>
+            <w:pPr>
+              <w:jc w:val="left"/>
+            </w:pPr>
+            <w:r>
+              <w:rPr>
+                <w:b w:val="false"/>
+                <w:bCs w:val="false"/>
+                <w:sz w:val="19"/>
+                <w:szCs w:val="19"/>
+              </w:rPr>
               <w:t xml:space="preserve">Selectivity, direct arm</w:t>
             </w:r>
           </w:p>
@@ -4560,6 +4814,133 @@
                 <w:szCs w:val="19"/>
               </w:rPr>
               <w:t xml:space="preserve">0.487</w:t>
+            </w:r>
+          </w:p>
+        </w:tc>
+        <w:tc>
+          <w:tcPr>
+            <w:tcW w:type="dxa" w:w="1000"/>
+            <w:tcMar>
+              <w:top w:type="dxa" w:w="40"/>
+              <w:left w:type="dxa" w:w="80"/>
+              <w:bottom w:type="dxa" w:w="40"/>
+              <w:right w:type="dxa" w:w="80"/>
+            </w:tcMar>
+          </w:tcPr>
+          <w:p>
+            <w:pPr>
+              <w:jc w:val="center"/>
+            </w:pPr>
+            <w:r>
+              <w:rPr>
+                <w:b w:val="false"/>
+                <w:bCs w:val="false"/>
+                <w:sz w:val="19"/>
+                <w:szCs w:val="19"/>
+              </w:rPr>
+              <w:t xml:space="preserve">150</w:t>
+            </w:r>
+          </w:p>
+        </w:tc>
+      </w:tr>
+      <w:tr>
+        <w:tc>
+          <w:tcPr>
+            <w:tcW w:type="dxa" w:w="2400"/>
+            <w:tcMar>
+              <w:top w:type="dxa" w:w="40"/>
+              <w:left w:type="dxa" w:w="80"/>
+              <w:bottom w:type="dxa" w:w="40"/>
+              <w:right w:type="dxa" w:w="80"/>
+            </w:tcMar>
+          </w:tcPr>
+          <w:p>
+            <w:pPr>
+              <w:jc w:val="left"/>
+            </w:pPr>
+            <w:r>
+              <w:rPr>
+                <w:b w:val="false"/>
+                <w:bCs w:val="false"/>
+                <w:sz w:val="19"/>
+                <w:szCs w:val="19"/>
+              </w:rPr>
+              <w:t xml:space="preserve">Interaction (ablation)</w:t>
+            </w:r>
+          </w:p>
+        </w:tc>
+        <w:tc>
+          <w:tcPr>
+            <w:tcW w:type="dxa" w:w="1450"/>
+            <w:tcMar>
+              <w:top w:type="dxa" w:w="40"/>
+              <w:left w:type="dxa" w:w="80"/>
+              <w:bottom w:type="dxa" w:w="40"/>
+              <w:right w:type="dxa" w:w="80"/>
+            </w:tcMar>
+          </w:tcPr>
+          <w:p>
+            <w:pPr>
+              <w:jc w:val="center"/>
+            </w:pPr>
+            <w:r>
+              <w:rPr>
+                <w:b w:val="false"/>
+                <w:bCs w:val="false"/>
+                <w:sz w:val="19"/>
+                <w:szCs w:val="19"/>
+              </w:rPr>
+              <w:t xml:space="preserve">−2.7</w:t>
+            </w:r>
+          </w:p>
+        </w:tc>
+        <w:tc>
+          <w:tcPr>
+            <w:tcW w:type="dxa" w:w="1900"/>
+            <w:tcMar>
+              <w:top w:type="dxa" w:w="40"/>
+              <w:left w:type="dxa" w:w="80"/>
+              <w:bottom w:type="dxa" w:w="40"/>
+              <w:right w:type="dxa" w:w="80"/>
+            </w:tcMar>
+          </w:tcPr>
+          <w:p>
+            <w:pPr>
+              <w:jc w:val="center"/>
+            </w:pPr>
+            <w:r>
+              <w:rPr>
+                <w:b w:val="false"/>
+                <w:bCs w:val="false"/>
+                <w:sz w:val="19"/>
+                <w:szCs w:val="19"/>
+              </w:rPr>
+              <w:t xml:space="preserve">[−10.0, +4.7]</w:t>
+            </w:r>
+          </w:p>
+        </w:tc>
+        <w:tc>
+          <w:tcPr>
+            <w:tcW w:type="dxa" w:w="1350"/>
+            <w:tcMar>
+              <w:top w:type="dxa" w:w="40"/>
+              <w:left w:type="dxa" w:w="80"/>
+              <w:bottom w:type="dxa" w:w="40"/>
+              <w:right w:type="dxa" w:w="80"/>
+            </w:tcMar>
+          </w:tcPr>
+          <w:p>
+            <w:pPr>
+              <w:jc w:val="center"/>
+            </w:pPr>
+            <w:r>
+              <w:rPr>
+                <w:b w:val="false"/>
+                <w:bCs w:val="false"/>
+                <w:sz w:val="19"/>
+                <w:szCs w:val="19"/>
+              </w:rPr>
+              <w:t xml:space="preserve">0.493</w:t>
             </w:r>
           </w:p>
         </w:tc>
@@ -4730,7 +5111,7 @@
           <w:sz w:val="18"/>
           <w:szCs w:val="18"/>
         </w:rPr>
-        <w:t xml:space="preserve">Table 4. MATH-500 paired contrasts over the five available cells. The CoT-arm selectivity and the ablation interaction require cot_ablated and are pending.</w:t>
+        <w:t xml:space="preserve">Table 4. MATH-500 paired contrasts. The CoT-arm selectivity is the only contrast in the study whose CI excludes zero.</w:t>
       </w:r>
     </w:p>
     <w:p>
@@ -4743,7 +5124,7 @@
           <w:sz w:val="21"/>
           <w:szCs w:val="21"/>
         </w:rPr>
-        <w:t xml:space="preserve">Intact CoT accuracy is 94.0% — near ceiling, the mirror image of AIME's direct-arm floor — so the CoT arm has little headroom to show a deficit, and the random control in fact scores 2.0 points </w:t>
+        <w:t xml:space="preserve">Ablation left MATH-500 accuracy largely intact in absolute terms: the CoT arm drops 6.0 points to 88.0% (McNemar p = 0.078, marginal), and the drop is almost entirely non-termination rather than wrong answers — incorrect counts actually </w:t>
       </w:r>
       <w:r>
         <w:rPr>
@@ -4752,6 +5133,22 @@
           <w:sz w:val="21"/>
           <w:szCs w:val="21"/>
         </w:rPr>
+        <w:t xml:space="preserve">fall</w:t>
+      </w:r>
+      <w:r>
+        <w:rPr>
+          <w:sz w:val="21"/>
+          <w:szCs w:val="21"/>
+        </w:rPr>
+        <w:t xml:space="preserve"> from 3 to 1 while incompletes rise from 6 to 17, all 17 of them hits on the 16,384-token cap. But the contrast against the matched control is sharp: the random control scores 2.0 points </w:t>
+      </w:r>
+      <w:r>
+        <w:rPr>
+          <w:i/>
+          <w:iCs/>
+          <w:sz w:val="21"/>
+          <w:szCs w:val="21"/>
+        </w:rPr>
         <w:t xml:space="preserve">above</w:t>
       </w:r>
       <w:r>
@@ -4759,7 +5156,7 @@
           <w:sz w:val="21"/>
           <w:szCs w:val="21"/>
         </w:rPr>
-        <w:t xml:space="preserve"> intact (n.s.). The informative arm is direct: ablation costs 3.3 points (n.s.), but the matched random control costs 5.3 points and is the only McNemar-significant drop in the study (p = 0.008), so direct-arm selectivity is −2.0 [−6.7, +2.7] — targeted ablation no worse than random, consistent with GSM8K. The consequence lands in the control interaction: +7.3 points, 95% CI [+2.7, +12.7], p = 0.003 — </w:t>
+        <w:t xml:space="preserve"> intact, so CoT-arm selectivity is </w:t>
       </w:r>
       <w:r>
         <w:rPr>
@@ -4768,6 +5165,22 @@
           <w:sz w:val="21"/>
           <w:szCs w:val="21"/>
         </w:rPr>
+        <w:t xml:space="preserve">+8.0 points, 95% CI [+3.3, +13.3], p = 0.001 — the only selectivity in the study whose CI excludes zero</w:t>
+      </w:r>
+      <w:r>
+        <w:rPr>
+          <w:sz w:val="21"/>
+          <w:szCs w:val="21"/>
+        </w:rPr>
+        <w:t xml:space="preserve">. Which ten directions are removed matters in this arm. The direct arm shows the reverse: ablation costs 3.3 points (n.s.) but the random control costs 5.3 (p = 0.008, the only McNemar-significant drop), so direct-arm selectivity is −2.0 [−6.7, +2.7] — null, consistent with GSM8K. The ablation interaction is −2.7 [−10.0, +4.7] (null, wrong sign for H1), and the control interaction is +7.3 [+2.7, +12.7], p = 0.003 — </w:t>
+      </w:r>
+      <w:r>
+        <w:rPr>
+          <w:b/>
+          <w:bCs/>
+          <w:sz w:val="21"/>
+          <w:szCs w:val="21"/>
+        </w:rPr>
         <w:t xml:space="preserve">significantly non-zero</w:t>
       </w:r>
       <w:r>
@@ -4775,26 +5188,23 @@
           <w:sz w:val="21"/>
           <w:szCs w:val="21"/>
         </w:rPr>
-        <w:t xml:space="preserve">. Projecting out ten random unembedding directions hurts no-CoT answering more than CoT answering on this dataset. Intact CoT incompletes are 6/150 (4%), consistent with the disclosed budget-cap expectation (~15% of the level-5 fifth of the sample).</w:t>
-      </w:r>
-    </w:p>
-    <w:p>
-      <w:pPr>
-        <w:pBdr>
-          <w:left w:val="single" w:color="EDA100" w:sz="12"/>
-        </w:pBdr>
-        <w:shd w:fill="FFF3C4" w:val="clear"/>
-        <w:spacing w:after="140" w:before="100" w:line="264"/>
-      </w:pPr>
+        <w:t xml:space="preserve">: removing ten </w:t>
+      </w:r>
       <w:r>
         <w:rPr>
           <w:i/>
           <w:iCs/>
-          <w:color w:val="6b5900"/>
-          <w:sz w:val="21"/>
-          <w:szCs w:val="21"/>
-        </w:rPr>
-        <w:t xml:space="preserve">[Pending, by noon 8/6: the regenerated cot_ablated cell, giving the CoT-arm selectivity and the ablation interaction — which, per §5, must be read against the +7.3 control interaction rather than against zero.]</w:t>
+          <w:sz w:val="21"/>
+          <w:szCs w:val="21"/>
+        </w:rPr>
+        <w:t xml:space="preserve">random</w:t>
+      </w:r>
+      <w:r>
+        <w:rPr>
+          <w:sz w:val="21"/>
+          <w:szCs w:val="21"/>
+        </w:rPr>
+        <w:t xml:space="preserve"> directions hurts no-CoT answering more than CoT answering here, so the ablation interaction must be read against +7.3, not zero — and its distance from that baseline, −10.0 points, is just the two selectivities' difference. Intact CoT incompletes are 6/150 (4%), consistent with the disclosed budget-cap expectation.</w:t>
       </w:r>
     </w:p>
     <w:p>
@@ -6944,7 +7354,7 @@
           <w:sz w:val="18"/>
           <w:szCs w:val="18"/>
         </w:rPr>
-        <w:t xml:space="preserve">Figure 1. Accuracy by cell. *AIME cot_ablated is n = 20 of 30 (the degeneration gate fired); MATH-500 cot_ablated is pending (records lost; due 8/6).</w:t>
+        <w:t xml:space="preserve">Figure 1. Accuracy by cell. *AIME cot_ablated is n = 20 of 30 (the degeneration gate fired).</w:t>
       </w:r>
     </w:p>
     <w:p>
@@ -6955,7 +7365,7 @@
       <w:r>
         <w:drawing>
           <wp:inline distT="0" distB="0" distL="0" distR="0">
-            <wp:extent cx="5120640" cy="4718304"/>
+            <wp:extent cx="5120640" cy="5358384"/>
             <wp:effectExtent t="0" r="0" b="0" l="0"/>
             <wp:docPr id="1" name="" descr="" title=""/>
             <wp:cNvGraphicFramePr>
@@ -6980,7 +7390,7 @@
                   <pic:spPr bwMode="auto">
                     <a:xfrm>
                       <a:off x="0" y="0"/>
-                      <a:ext cx="5120640" cy="4718304"/>
+                      <a:ext cx="5120640" cy="5358384"/>
                     </a:xfrm>
                     <a:prstGeom prst="rect">
                       <a:avLst/>
@@ -7006,7 +7416,7 @@
           <w:sz w:val="18"/>
           <w:szCs w:val="18"/>
         </w:rPr>
-        <w:t xml:space="preserve">Figure 2. Pre-registered contrasts with 95% bootstrap CIs. H1 predicts a positive ablation interaction; the random-control interaction should sit at zero — on MATH-500 it does not (+7.3, p = 0.003). MATH-500's CoT-arm selectivity and ablation interaction await the regenerated cot_ablated cell.</w:t>
+        <w:t xml:space="preserve">Figure 2. Pre-registered contrasts with 95% bootstrap CIs. H1 predicts a positive ablation interaction; the random-control interaction should sit at zero — on MATH-500 it does not (+7.3, p = 0.003). MATH-500's CoT-arm selectivity is the one contrast excluding zero.</w:t>
       </w:r>
     </w:p>
     <w:p>
@@ -7044,7 +7454,7 @@
           <w:sz w:val="21"/>
           <w:szCs w:val="21"/>
         </w:rPr>
-        <w:t xml:space="preserve">On GSM8K — the only dataset where both arms are off floor and fully powered — the interaction is slightly negative and its CI excludes the large positive effect H1 predicted: a substitution effect of ≥8 points would have been visible, and none was. The nominally significant CoT ablation drop (p = 0.035) does not survive the matched control; at this band and strength, projecting out the top-10 readout directions is not measurably worse than projecting out 10 random unembedding rows. We report this as an informative null for large effects, not merely an absence of evidence.</w:t>
+        <w:t xml:space="preserve">Both complete, fully-powered datasets return null interactions of the wrong sign: GSM8K at −3.3 [−10.7, +4.0] and MATH-500 at −2.7 [−10.0, +4.7]. A substitution effect of ≥8 points would have been visible on either, and none was. On GSM8K the nominally significant CoT drop (p = 0.035) does not survive the matched control; on MATH-500, correcting for the non-zero control baseline moves the result further from H1, not closer (below). We report these as informative nulls for large substitution effects, not merely an absence of evidence.</w:t>
       </w:r>
     </w:p>
     <w:p>
@@ -7059,14 +7469,30 @@
           <w:sz w:val="21"/>
           <w:szCs w:val="21"/>
         </w:rPr>
-        <w:t xml:space="preserve">The difficulty trend runs opposite to substitution, but is inconclusive. </w:t>
-      </w:r>
-      <w:r>
-        <w:rPr>
-          <w:sz w:val="21"/>
-          <w:szCs w:val="21"/>
-        </w:rPr>
-        <w:t xml:space="preserve">The only suggestive targeted effect in the study is in the AIME CoT arm (+20 points selectivity), i.e., ablation biting harder exactly where reasoning is longest — the direction H2's complementary account predicts, not H1. Three things stop us from claiming it: the CI touches zero and is 40 points wide; the deficit is mostly non-termination — eight of the nine ablated failures ran to the token cap, which is the very observation that fired the gate, so the selectivity estimate and the gate are one finding counted twice, not corroborating evidence; and the direct arm's floor removes the within-dataset interaction that would anchor the comparison. MATH-500 sits between the two in difficulty with both arms off floor and should adjudicate — but its CoT arm is near ceiling (94%) and its control interaction is significantly non-zero, so its pending ablation interaction must clear +7.3 points, not zero.</w:t>
+        <w:t xml:space="preserve">The one significant targeted effect is in the arm H1 predicted would be protected — and it scales with difficulty. </w:t>
+      </w:r>
+      <w:r>
+        <w:rPr>
+          <w:sz w:val="21"/>
+          <w:szCs w:val="21"/>
+        </w:rPr>
+        <w:t xml:space="preserve">MATH-500's CoT-arm selectivity of +8.0 [+3.3, +13.3] (p = 0.001) is the study's only contrast excluding zero: removing the ten J-lens directions costs CoT accuracy 8 points more than removing ten random ones. Absolute damage stays modest — the ablated model still scores 88% — and the deficit is not wrong answers but non-termination: incorrect counts fall from 3 to 1 while all 17 added failures are cap hits. AIME shows the same signature at larger magnitude but without significance (+20.0, CI touching zero, 40 points wide; eight of nine ablated failures at cap — the very observation that fired the gate, so the selectivity and the gate are one finding counted twice; and the direct arm's floor removes the interaction that would anchor it). Across datasets, CoT-arm selectivity is monotone in difficulty: +2.0 (n.s.) → +8.0 (p = 0.001) → +20.0 (underpowered). This is the complementary account's prediction (H2), not substitution's: the harder the problem, the more the model appears to lean on workspace state </w:t>
+      </w:r>
+      <w:r>
+        <w:rPr>
+          <w:i/>
+          <w:iCs/>
+          <w:sz w:val="21"/>
+          <w:szCs w:val="21"/>
+        </w:rPr>
+        <w:t xml:space="preserve">while</w:t>
+      </w:r>
+      <w:r>
+        <w:rPr>
+          <w:sz w:val="21"/>
+          <w:szCs w:val="21"/>
+        </w:rPr>
+        <w:t xml:space="preserve"> externalizing — and the ablation's specific, selective effect is to stop chains of thought from terminating.</w:t>
       </w:r>
     </w:p>
     <w:p>
@@ -7120,26 +7546,23 @@
           <w:sz w:val="21"/>
           <w:szCs w:val="21"/>
         </w:rPr>
-        <w:t xml:space="preserve"> ten directions in the band while CoT answering absorbs the same damage (94–96% regardless) — a real internal/external asymmetry, but one about the degradation-robustness that externalized reasoning confers, not about the J-space specifically. Methodologically, it means the pre-registered rule of reading the ablation interaction against zero is insufficient on this dataset: when the regenerated cot_ablated cell lands, only the excess over +7.3 can be attributed to J-space targeting. The direct-arm selectivity of −2.0 is meanwhile consistent with GSM8K's null — nowhere that both can be measured do the targeted directions do more damage than random ones.</w:t>
-      </w:r>
-    </w:p>
-    <w:p>
-      <w:pPr>
-        <w:pBdr>
-          <w:left w:val="single" w:color="EDA100" w:sz="12"/>
-        </w:pBdr>
-        <w:shd w:fill="FFF3C4" w:val="clear"/>
-        <w:spacing w:after="140" w:before="100" w:line="264"/>
-      </w:pPr>
+        <w:t xml:space="preserve"> ten directions in the band while CoT answering absorbs the same damage — a real internal/external asymmetry, but one about the degradation-robustness that externalized reasoning confers, not about the J-space specifically. Methodologically, it means the pre-registered rule of reading the ablation interaction against zero is insufficient on this dataset: only the difference from +7.3 can be attributed to J-space targeting. The regenerated cell's interaction of −2.7 sits 10.0 points </w:t>
+      </w:r>
       <w:r>
         <w:rPr>
           <w:i/>
           <w:iCs/>
-          <w:color w:val="6b5900"/>
-          <w:sz w:val="21"/>
-          <w:szCs w:val="21"/>
-        </w:rPr>
-        <w:t xml:space="preserve">[Pending cot_ablated (due noon 8/6): the MATH-500 CoT-arm selectivity and ablation interaction, read against the +7.3 control baseline, and the H2 monotonicity check GSM8K → MATH-500 → AIME; plus a per-level breakdown as a within-dataset difficulty test.]</w:t>
+          <w:sz w:val="21"/>
+          <w:szCs w:val="21"/>
+        </w:rPr>
+        <w:t xml:space="preserve">below</w:t>
+      </w:r>
+      <w:r>
+        <w:rPr>
+          <w:sz w:val="21"/>
+          <w:szCs w:val="21"/>
+        </w:rPr>
+        <w:t xml:space="preserve"> that baseline — exactly the direct arm's null selectivity (−2.0) minus the CoT arm's significant one (+8.0) — so correcting for the arm-dependent broad degradation pushes the result away from substitution, not toward it.</w:t>
       </w:r>
     </w:p>
     <w:p>
@@ -7279,7 +7702,7 @@
           <w:sz w:val="21"/>
           <w:szCs w:val="21"/>
         </w:rPr>
-        <w:t xml:space="preserve">Incomplete counts rise under both ablation and control (GSM8K CoT: 24 → 30/28), so part of every drop is non-termination rather than wrong reasoning. The caps are shared across states, and the control absorbs the same penalty, so this biases the selectivity estimates toward zero rather than manufacturing effects — but on AIME the 8/20 ablated cap-hit rate is what fired the gate, and there non-termination is not a nuisance on top of the effect, it is the effect.</w:t>
+        <w:t xml:space="preserve">Incomplete counts rise under both ablation and control (GSM8K CoT: 24 → 30/28), so part of every drop is non-termination rather than wrong reasoning. The caps are shared across states, and the control absorbs the same penalty, so this biases the selectivity estimates toward zero rather than manufacturing effects — but on AIME the 8/20 ablated cap-hit rate is what fired the gate, and on MATH-500 the significant +8.0 selectivity is carried entirely by cap hits (17 of 18 added failures). On both, non-termination is not a nuisance on top of the effect — it is the effect, and “ablation selectively removes reasoning” and “ablation selectively makes generation fail to terminate” are not yet separable.</w:t>
       </w:r>
     </w:p>
     <w:p>
@@ -7322,7 +7745,7 @@
           <w:sz w:val="22"/>
           <w:szCs w:val="22"/>
         </w:rPr>
-        <w:t xml:space="preserve">What we would test next</w:t>
+        <w:t xml:space="preserve">What I would test next</w:t>
       </w:r>
     </w:p>
     <w:p>
@@ -7340,7 +7763,7 @@
           <w:sz w:val="21"/>
           <w:szCs w:val="21"/>
         </w:rPr>
-        <w:t xml:space="preserve">Add the regenerated MATH-500 cot_ablated cell (due 8/6) and read its interaction against the +7.3 control baseline. For AIME, generating the last 10 cot_ablated problems would mean overriding a fired pre-registered gate — a documented shard script exists for it (src/shard_ablated_tail.sh, with a mandatory disclosure file) — but the defensible fix is revising the cap or band and re-running the cell under the gate, not completing it unguarded.</w:t>
+        <w:t xml:space="preserve">I would re-run the 17 capped MATH-500 cot_ablated generations at a doubled cap, to separate “ablated CoT never terminates” from “ablated CoT is slower”: the +8.0 selectivity is currently carried entirely by cap censoring, and the two readings differ in what they say about the workspace.</w:t>
       </w:r>
     </w:p>
     <w:p>
@@ -7358,7 +7781,7 @@
           <w:sz w:val="21"/>
           <w:szCs w:val="21"/>
         </w:rPr>
-        <w:t xml:space="preserve">A dose–response curve over band width (light → medium → heavy) with the coherence gate as the stopping rule, testing whether selectivity appears before degeneration does.</w:t>
+        <w:t xml:space="preserve">With more compute and time, I would raise the AIME token cap — recalibrating it with an actual measurement (run.py --calibrate-caps, up to the checkpoint's 40,960-position ceiling) instead of the uncalibrated 32,768 budget ceiling — and re-run cot_ablated under the gate. That is the defensible way to recover the cell the gate stopped: generating the missing 10 problems as-is would mean overriding a fired pre-registered gate (a documented shard script exists for it, src/shard_ablated_tail.sh, with a mandatory disclosure file), and 40% of ablated generations hitting the current cap is precisely the finding a bigger cap would let us read past.</w:t>
       </w:r>
     </w:p>
     <w:p>
@@ -7376,23 +7799,7 @@
           <w:sz w:val="21"/>
           <w:szCs w:val="21"/>
         </w:rPr>
-        <w:t xml:space="preserve">The </w:t>
-      </w:r>
-      <w:r>
-        <w:rPr>
-          <w:i/>
-          <w:iCs/>
-          <w:sz w:val="21"/>
-          <w:szCs w:val="21"/>
-        </w:rPr>
-        <w:t xml:space="preserve">nothink</w:t>
-      </w:r>
-      <w:r>
-        <w:rPr>
-          <w:sz w:val="21"/>
-          <w:szCs w:val="21"/>
-        </w:rPr>
-        <w:t xml:space="preserve"> middle rung (thinking disabled, no answer-only instruction), pre-registered but unrun — it separates “no externalization” from “forced immediate answer”.</w:t>
+        <w:t xml:space="preserve">I would ablate different layers of Qwen3-4B. Everything here used the paper's light band mapped to layers 14–19, where the directions probe says the answer is not yet linearly readable; a dose–response curve over band width (light → medium → heavy) and a powered sweep over band position — the exploratory sliding-window comparison found no window with selective damage, but only at n = 12 on GSM8K — would show whether selectivity appears elsewhere in depth before coherence degrades, with the degeneration gate as the stopping rule.</w:t>
       </w:r>
     </w:p>
     <w:p>
@@ -7410,7 +7817,23 @@
           <w:sz w:val="21"/>
           <w:szCs w:val="21"/>
         </w:rPr>
-        <w:t xml:space="preserve">Estimate actual per-layer Jacobians on a subset of prompts to test whether J ≠ I selects materially different directions in the workspace band — the direct test of the biggest approximation in this study.</w:t>
+        <w:t xml:space="preserve">I would run the </w:t>
+      </w:r>
+      <w:r>
+        <w:rPr>
+          <w:i/>
+          <w:iCs/>
+          <w:sz w:val="21"/>
+          <w:szCs w:val="21"/>
+        </w:rPr>
+        <w:t xml:space="preserve">nothink</w:t>
+      </w:r>
+      <w:r>
+        <w:rPr>
+          <w:sz w:val="21"/>
+          <w:szCs w:val="21"/>
+        </w:rPr>
+        <w:t xml:space="preserve"> middle rung (thinking disabled, no answer-only instruction), pre-registered but unrun — it separates “no externalization” from “forced immediate answer”.</w:t>
       </w:r>
     </w:p>
     <w:p>
@@ -7428,7 +7851,25 @@
           <w:sz w:val="21"/>
           <w:szCs w:val="21"/>
         </w:rPr>
-        <w:t xml:space="preserve">Report observed power: re-run the power analysis at the measured accuracies and correlation, so the widths of the null CIs are themselves interpretable.</w:t>
+        <w:t xml:space="preserve">I would estimate actual per-layer Jacobians on a subset of prompts to test whether J ≠ I selects materially different directions in the workspace band — the direct test of the biggest approximation in this study.</w:t>
+      </w:r>
+    </w:p>
+    <w:p>
+      <w:pPr>
+        <w:pStyle w:val="ListParagraph"/>
+        <w:numPr>
+          <w:ilvl w:val="0"/>
+          <w:numId w:val="2"/>
+        </w:numPr>
+        <w:spacing w:after="80" w:line="264"/>
+        <w:jc w:val="both"/>
+      </w:pPr>
+      <w:r>
+        <w:rPr>
+          <w:sz w:val="21"/>
+          <w:szCs w:val="21"/>
+        </w:rPr>
+        <w:t xml:space="preserve">I would report observed power: re-run the power analysis at the measured accuracies and correlation, so the widths of the null CIs are themselves interpretable.</w:t>
       </w:r>
     </w:p>
     <w:p>

</xml_diff>